<commit_message>
EL MINUTO DEL ESTUDIANTE: 7 words (1 por profe) con 4 videos = 4 semanas; el profe dirige, el estudiante habla; mitiga riesgo IP y es la prueba viviente
Co-Authored-By: Claude Fable 5 <noreply@anthropic.com>
</commit_message>
<xml_diff>
--- a/recursos/comercial/campañas/guiones_profes/GUION_Amina.docx
+++ b/recursos/comercial/campañas/guiones_profes/GUION_Amina.docx
@@ -12,7 +12,7 @@
           <w:color w:val="E54C09"/>
           <w:sz w:val="28"/>
         </w:rPr>
-        <w:t>HEIIU — TU VIDEO DE ESTA SEMANA · AMINA</w:t>
+        <w:t>HEIIU — EL MINUTO DEL ESTUDIANTE · AMINA</w:t>
       </w:r>
     </w:p>
     <w:p>
@@ -25,7 +25,7 @@
           <w:color w:val="8A7A6A"/>
           <w:sz w:val="20"/>
         </w:rPr>
-        <w:t>Aquí tienes TRES opciones. Escoge UNA — la que te dé menos susto. Con una cumples la semana; si te animas a más, mejor.</w:t>
+        <w:t>4 videos = 4 semanas (1 por semana, en el orden que quieras). TÚ diriges y grabas — EL ESTUDIANTE habla a cámara.</w:t>
       </w:r>
     </w:p>
     <w:p>
@@ -35,7 +35,7 @@
           <w:color w:val="E54C09"/>
           <w:sz w:val="24"/>
         </w:rPr>
-        <w:t>CÓMO GRABAR (igual para las tres)</w:t>
+        <w:t>CÓMO FUNCIONA (10 minutos al final de UNA clase por semana)</w:t>
       </w:r>
     </w:p>
     <w:p>
@@ -43,9 +43,60 @@
         <w:rPr>
           <w:b w:val="0"/>
           <w:i w:val="0"/>
+          <w:sz w:val="22"/>
+        </w:rPr>
+        <w:t>1. Pídele a Jacqueline el TELÉFONO y el MICRÓFONO de grabación.</w:t>
+      </w:r>
+    </w:p>
+    <w:p>
+      <w:r>
+        <w:rPr>
+          <w:b w:val="0"/>
+          <w:i w:val="0"/>
+          <w:sz w:val="22"/>
+        </w:rPr>
+        <w:t>2. Escoge 1-2 VOLUNTARIOS (jamás obligado — el que quiera salir). Si es menor de edad, avísale a Diana ANTES para la autorización del acudiente.</w:t>
+      </w:r>
+    </w:p>
+    <w:p>
+      <w:r>
+        <w:rPr>
+          <w:b w:val="0"/>
+          <w:i w:val="0"/>
+          <w:sz w:val="22"/>
+        </w:rPr>
+        <w:t>3. El guion se escribe en el TABLERO (o se muestra en el teléfono). Lo ensayan 2 veces y se graba. Máximo 3 tomas — la espontaneidad vale más que la perfección.</w:t>
+      </w:r>
+    </w:p>
+    <w:p>
+      <w:r>
+        <w:rPr>
+          <w:b w:val="0"/>
+          <w:i w:val="0"/>
+          <w:sz w:val="22"/>
+        </w:rPr>
+        <w:t>4. Vertical (9:16), teléfono a la altura de los ojos, luz de frente. El estudiante puede leer del tablero — se ve natural.</w:t>
+      </w:r>
+    </w:p>
+    <w:p>
+      <w:r>
+        <w:rPr>
+          <w:b w:val="0"/>
+          <w:i w:val="0"/>
+          <w:sz w:val="22"/>
+        </w:rPr>
+        <w:t>5. Manda el CRUDO por WhatsApp a Diana ese mismo día. Sin editar — el texto en pantalla lo pone el editor.</w:t>
+      </w:r>
+    </w:p>
+    <w:p>
+      <w:r>
+        <w:rPr>
+          <w:b w:val="0"/>
+          <w:i/>
+          <w:color w:val="8A7A6A"/>
           <w:sz w:val="20"/>
         </w:rPr>
-        <w:t>Vertical (9:16) · celular a la altura de los ojos · luz de frente · pega el guion en una app de teleprompter (BIGVU, gratis) y léelo — no hay que memorizar · lo que está en inglés se dice DESPACIO y claro · máximo 2 tomas · manda el crudo por WhatsApp a Diana, sin editar. Lo de [corchetes] no se dice.</w:t>
+        <w:t>Esto también es pedagogía: grabarse hablando construye confianza y alimenta su portafolio. No es un favor a la academia — es una actividad de clase.</w:t>
       </w:r>
     </w:p>
     <w:p>
@@ -55,7 +106,7 @@
           <w:color w:val="E54C09"/>
           <w:sz w:val="24"/>
         </w:rPr>
-        <w:t>OPCIÓN A — “Ese ¿sí o no? te delata” (30 seg · la más potente)</w:t>
+        <w:t>SEMANA A — “Yo decía…” (el error contado por quien lo cometió · 20-25 seg)</w:t>
       </w:r>
     </w:p>
     <w:p>
@@ -66,7 +117,7 @@
           <w:color w:val="8A7A6A"/>
           <w:sz w:val="19"/>
         </w:rPr>
-        <w:t>[A cámara, con energía]</w:t>
+        <w:t>[El estudiante a cámara. Tono: confesión divertida]</w:t>
       </w:r>
     </w:p>
     <w:p>
@@ -76,7 +127,7 @@
           <w:i w:val="0"/>
           <w:sz w:val="23"/>
         </w:rPr>
-        <w:t>¿Dices “¿sí o no?” cuando estás hablando inglés? … Ese “¿sí o no?” te delata.</w:t>
+        <w:t>ESTUDIANTE: “Yo antes decía… ‘I no like’.” [pausa, risa permitida] “Hasta que aquí aprendí que se dice: ‘I DON'T like’.”</w:t>
       </w:r>
     </w:p>
     <w:p>
@@ -86,7 +137,7 @@
           <w:i w:val="0"/>
           <w:sz w:val="23"/>
         </w:rPr>
-        <w:t>Y ojo: no es que no sepas inglés — es que estás traduciendo del español.</w:t>
+        <w:t>ESTUDIANTE: “El “no” pelado no niega en inglés — se necesita don’t o doesn’t.”</w:t>
       </w:r>
     </w:p>
     <w:p>
@@ -96,37 +147,7 @@
           <w:i w:val="0"/>
           <w:sz w:val="23"/>
         </w:rPr>
-        <w:t>[DESPACIO, uno por uno] En vez de eso, di:  …right?   ·   …don’t you think?   ·   …you know what I mean?</w:t>
-      </w:r>
-    </w:p>
-    <w:p>
-      <w:r>
-        <w:rPr>
-          <w:b/>
-          <w:i w:val="0"/>
-          <w:sz w:val="23"/>
-        </w:rPr>
-        <w:t>Por ejemplo: “Está bueno, ¿sí o no?” → “It’s good, right?”</w:t>
-      </w:r>
-    </w:p>
-    <w:p>
-      <w:r>
-        <w:rPr>
-          <w:b/>
-          <w:i w:val="0"/>
-          <w:sz w:val="23"/>
-        </w:rPr>
-        <w:t>[Cierre] Confirmas sin traducir. Deja de traducir — repite estas hoy. Episodio 4.</w:t>
-      </w:r>
-    </w:p>
-    <w:p>
-      <w:r>
-        <w:rPr>
-          <w:b/>
-          <w:color w:val="E54C09"/>
-          <w:sz w:val="24"/>
-        </w:rPr>
-        <w:t>OPCIÓN B — El error real de clase (20 seg · más corta)</w:t>
+        <w:t>ESTUDIANTE: “¿Tú también lo decías? Confiésalo en los comentarios.”</w:t>
       </w:r>
     </w:p>
     <w:p>
@@ -137,57 +158,17 @@
           <w:color w:val="8A7A6A"/>
           <w:sz w:val="19"/>
         </w:rPr>
-        <w:t>[A cámara]</w:t>
+        <w:t>(Si el estudiante tiene OTRO error suyo real y quiere contar ese, MEJOR — más auténtico.)</w:t>
       </w:r>
     </w:p>
     <w:p>
       <w:r>
         <w:rPr>
           <w:b/>
-          <w:i w:val="0"/>
-          <w:sz w:val="23"/>
-        </w:rPr>
-        <w:t>Este error lo escuchamos en clase esta semana: “I no like”. … Y así lo dicen miles.</w:t>
-      </w:r>
-    </w:p>
-    <w:p>
-      <w:r>
-        <w:rPr>
-          <w:b/>
-          <w:i w:val="0"/>
-          <w:sz w:val="23"/>
-        </w:rPr>
-        <w:t>[DESPACIO] En inglés se dice: “I DON'T like”. Otra vez: “I DON'T like”.</w:t>
-      </w:r>
-    </w:p>
-    <w:p>
-      <w:r>
-        <w:rPr>
-          <w:b/>
-          <w:i w:val="0"/>
-          <w:sz w:val="23"/>
-        </w:rPr>
-        <w:t>El “no” pelado no niega en inglés — necesitas don’t o doesn’t.</w:t>
-      </w:r>
-    </w:p>
-    <w:p>
-      <w:r>
-        <w:rPr>
-          <w:b/>
-          <w:i w:val="0"/>
-          <w:sz w:val="23"/>
-        </w:rPr>
-        <w:t>Repítelo hoy — y síguenos para el error de la próxima semana.</w:t>
-      </w:r>
-    </w:p>
-    <w:p>
-      <w:r>
-        <w:rPr>
-          <w:b/>
-          <w:color w:val="1E6E42"/>
+          <w:color w:val="E54C09"/>
           <w:sz w:val="24"/>
         </w:rPr>
-        <w:t>OPCIÓN C — La Frase del Día (15 seg · la más fácil)</w:t>
+        <w:t>SEMANA B — “Ese ‘¿sí o no?’ te delata” (el estudiante da la mini-lección · 30 seg)</w:t>
       </w:r>
     </w:p>
     <w:p>
@@ -198,7 +179,7 @@
           <w:color w:val="8A7A6A"/>
           <w:sz w:val="19"/>
         </w:rPr>
-        <w:t>[A cámara, puedes estar junto al tablero]</w:t>
+        <w:t>[El estudiante a cámara — él/ella ES el profe hoy]</w:t>
       </w:r>
     </w:p>
     <w:p>
@@ -208,7 +189,7 @@
           <w:i w:val="0"/>
           <w:sz w:val="23"/>
         </w:rPr>
-        <w:t>La frase de hoy en nuestros tableros: [DESPACIO] “You are loved, you are helped, and you are needed.”.</w:t>
+        <w:t>ESTUDIANTE: “¿Dices ‘¿sí o no?’ cuando hablas inglés? Ese ‘¿sí o no?’ te delata. No es que no sepas — estás traduciendo del español.”</w:t>
       </w:r>
     </w:p>
     <w:p>
@@ -218,7 +199,7 @@
           <w:i w:val="0"/>
           <w:sz w:val="23"/>
         </w:rPr>
-        <w:t>Significa: “Eres amado, eres ayudado y eres necesario.”</w:t>
+        <w:t>ESTUDIANTE [DESPACIO, uno por uno]: “En vez de eso, di:  …right?   ·   …don’t you think?   ·   …you know what I mean?”</w:t>
       </w:r>
     </w:p>
     <w:p>
@@ -228,7 +209,110 @@
           <w:i w:val="0"/>
           <w:sz w:val="23"/>
         </w:rPr>
-        <w:t>Repítela conmigo: “You are loved, you are helped, and you are needed.”. … Frase del día — del tablero de Heiiu para ti.</w:t>
+        <w:t>ESTUDIANTE: “Por ejemplo: “Está bueno, ¿sí o no?” → “It’s good, right?”. Repítelas hoy — deja de traducir.”</w:t>
+      </w:r>
+    </w:p>
+    <w:p>
+      <w:r>
+        <w:rPr>
+          <w:b/>
+          <w:color w:val="1E6E42"/>
+          <w:sz w:val="24"/>
+        </w:rPr>
+        <w:t>SEMANA C — La Frase del Día, por un estudiante (15 seg · la más fácil)</w:t>
+      </w:r>
+    </w:p>
+    <w:p>
+      <w:r>
+        <w:rPr>
+          <w:b w:val="0"/>
+          <w:i/>
+          <w:color w:val="8A7A6A"/>
+          <w:sz w:val="19"/>
+        </w:rPr>
+        <w:t>[El estudiante junto al tablero con la frase escrita]</w:t>
+      </w:r>
+    </w:p>
+    <w:p>
+      <w:r>
+        <w:rPr>
+          <w:b/>
+          <w:i w:val="0"/>
+          <w:sz w:val="23"/>
+        </w:rPr>
+        <w:t>ESTUDIANTE: “La frase de hoy en nuestro tablero: [DESPACIO] ‘You are loved, you are helped, and you are needed.’.”</w:t>
+      </w:r>
+    </w:p>
+    <w:p>
+      <w:r>
+        <w:rPr>
+          <w:b/>
+          <w:i w:val="0"/>
+          <w:sz w:val="23"/>
+        </w:rPr>
+        <w:t>ESTUDIANTE: “Significa: ‘Eres amado, eres ayudado y eres necesario.’. Repítela conmigo: ‘You are loved, you are helped, and you are needed.’.”</w:t>
+      </w:r>
+    </w:p>
+    <w:p>
+      <w:r>
+        <w:rPr>
+          <w:b/>
+          <w:i w:val="0"/>
+          <w:sz w:val="23"/>
+        </w:rPr>
+        <w:t>ESTUDIANTE: “Frase del día — del tablero de Heiiu para ti.”</w:t>
+      </w:r>
+    </w:p>
+    <w:p>
+      <w:r>
+        <w:rPr>
+          <w:b/>
+          <w:color w:val="1E6E42"/>
+          <w:sz w:val="24"/>
+        </w:rPr>
+        <w:t>SEMANA D — “Mi minuto en inglés” (el estudiante habla EN INGLÉS · 30-40 seg)</w:t>
+      </w:r>
+    </w:p>
+    <w:p>
+      <w:r>
+        <w:rPr>
+          <w:b w:val="0"/>
+          <w:i/>
+          <w:color w:val="8A7A6A"/>
+          <w:sz w:val="19"/>
+        </w:rPr>
+        <w:t>[El formato más poderoso: no decimos que hablan — SE VEN hablando. Subtítulos los pone el editor]</w:t>
+      </w:r>
+    </w:p>
+    <w:p>
+      <w:r>
+        <w:rPr>
+          <w:b/>
+          <w:i w:val="0"/>
+          <w:sz w:val="23"/>
+        </w:rPr>
+        <w:t>ESTUDIANTE (EN INGLÉS, guiado por ti con estas preguntas): “Hi! I’m ___” · qué estudia o hace · hace cuánto estudia en Heiiu · qué es lo que más le gusta · su meta con el inglés (viajar, trabajo, Au Pair…).</w:t>
+      </w:r>
+    </w:p>
+    <w:p>
+      <w:r>
+        <w:rPr>
+          <w:b/>
+          <w:i w:val="0"/>
+          <w:sz w:val="23"/>
+        </w:rPr>
+        <w:t>Cierre EN ESPAÑOL: “Hace ___ meses no podía decir nada de esto.”</w:t>
+      </w:r>
+    </w:p>
+    <w:p>
+      <w:r>
+        <w:rPr>
+          <w:b w:val="0"/>
+          <w:i/>
+          <w:color w:val="8A7A6A"/>
+          <w:sz w:val="19"/>
+        </w:rPr>
+        <w:t>(Escoge para esta semana al estudiante con más nivel del grupo — o al que MÁS haya avanzado, que impresiona igual.)</w:t>
       </w:r>
     </w:p>
     <w:p>
@@ -248,7 +332,7 @@
           <w:i w:val="0"/>
           <w:sz w:val="20"/>
         </w:rPr>
-        <w:t>El texto en pantalla lo pone el editor — tú solo graba y manda. Gracias por hacer parte: tu cara es la de la academia.</w:t>
+        <w:t>1 video por semana = 4 al mes y tu grupo queda al día. Voluntarios siempre. Menores → autorización primero. El crudo a Diana el mismo día. Gracias — tus estudiantes son la mejor prueba de tu trabajo.</w:t>
       </w:r>
     </w:p>
     <w:sectPr>

</xml_diff>